<commit_message>
docs: refresh reviewed client agreement
</commit_message>
<xml_diff>
--- a/docs/contracts/WD_Web_Solutions_Austin_Surface_Pros_Web_Development_Agreement_REVIEW.docx
+++ b/docs/contracts/WD_Web_Solutions_Austin_Surface_Pros_Web_Development_Agreement_REVIEW.docx
@@ -143,7 +143,7 @@
     </w:p>
     <w:p>
       <w:pPr>
-        <w:pStyle w:val="AgreementHeading"/>
+        <w:pStyle w:val="Heading1"/>
         <w:keepNext/>
       </w:pPr>
       <w:r>
@@ -176,7 +176,7 @@
     </w:p>
     <w:p>
       <w:pPr>
-        <w:pStyle w:val="AgreementHeading"/>
+        <w:pStyle w:val="Heading1"/>
         <w:keepNext/>
       </w:pPr>
       <w:r>
@@ -260,7 +260,7 @@
     </w:p>
     <w:p>
       <w:pPr>
-        <w:pStyle w:val="AgreementHeading"/>
+        <w:pStyle w:val="Heading1"/>
         <w:keepNext/>
       </w:pPr>
       <w:r>
@@ -398,7 +398,7 @@
     </w:p>
     <w:p>
       <w:pPr>
-        <w:pStyle w:val="AgreementHeading"/>
+        <w:pStyle w:val="Heading1"/>
         <w:keepNext/>
       </w:pPr>
       <w:r>
@@ -482,7 +482,7 @@
     </w:p>
     <w:p>
       <w:pPr>
-        <w:pStyle w:val="AgreementHeading"/>
+        <w:pStyle w:val="Heading1"/>
         <w:keepNext/>
       </w:pPr>
       <w:r>
@@ -549,7 +549,7 @@
     </w:p>
     <w:p>
       <w:pPr>
-        <w:pStyle w:val="AgreementHeading"/>
+        <w:pStyle w:val="Heading1"/>
         <w:keepNext/>
       </w:pPr>
       <w:r>
@@ -599,7 +599,7 @@
     </w:p>
     <w:p>
       <w:pPr>
-        <w:pStyle w:val="AgreementHeading"/>
+        <w:pStyle w:val="Heading1"/>
         <w:keepNext/>
       </w:pPr>
       <w:r>
@@ -649,7 +649,7 @@
     </w:p>
     <w:p>
       <w:pPr>
-        <w:pStyle w:val="AgreementHeading"/>
+        <w:pStyle w:val="Heading1"/>
         <w:keepNext/>
       </w:pPr>
       <w:r>
@@ -699,7 +699,7 @@
     </w:p>
     <w:p>
       <w:pPr>
-        <w:pStyle w:val="AgreementHeading"/>
+        <w:pStyle w:val="Heading1"/>
         <w:keepNext/>
       </w:pPr>
       <w:r>
@@ -749,7 +749,7 @@
     </w:p>
     <w:p>
       <w:pPr>
-        <w:pStyle w:val="AgreementHeading"/>
+        <w:pStyle w:val="Heading1"/>
         <w:keepNext/>
       </w:pPr>
       <w:r>
@@ -799,7 +799,7 @@
     </w:p>
     <w:p>
       <w:pPr>
-        <w:pStyle w:val="AgreementHeading"/>
+        <w:pStyle w:val="Heading1"/>
         <w:keepNext/>
       </w:pPr>
       <w:r>
@@ -849,7 +849,7 @@
     </w:p>
     <w:p>
       <w:pPr>
-        <w:pStyle w:val="AgreementHeading"/>
+        <w:pStyle w:val="Heading1"/>
         <w:keepNext/>
       </w:pPr>
       <w:r>
@@ -899,7 +899,7 @@
     </w:p>
     <w:p>
       <w:pPr>
-        <w:pStyle w:val="AgreementHeading"/>
+        <w:pStyle w:val="Heading1"/>
         <w:keepNext/>
       </w:pPr>
       <w:r>
@@ -949,7 +949,7 @@
     </w:p>
     <w:p>
       <w:pPr>
-        <w:pStyle w:val="AgreementHeading"/>
+        <w:pStyle w:val="Heading1"/>
         <w:keepNext/>
       </w:pPr>
       <w:r>
@@ -1016,7 +1016,7 @@
     </w:p>
     <w:p>
       <w:pPr>
-        <w:pStyle w:val="AgreementHeading"/>
+        <w:pStyle w:val="Heading1"/>
         <w:keepNext/>
       </w:pPr>
       <w:r>
@@ -1066,7 +1066,7 @@
     </w:p>
     <w:p>
       <w:pPr>
-        <w:pStyle w:val="AgreementHeading"/>
+        <w:pStyle w:val="Heading1"/>
         <w:keepNext/>
       </w:pPr>
       <w:r>
@@ -1099,7 +1099,7 @@
     </w:p>
     <w:p>
       <w:pPr>
-        <w:pStyle w:val="AgreementHeading"/>
+        <w:pStyle w:val="Heading1"/>
         <w:keepNext/>
       </w:pPr>
       <w:r>
@@ -1132,7 +1132,7 @@
     </w:p>
     <w:p>
       <w:pPr>
-        <w:pStyle w:val="AgreementHeading"/>
+        <w:pStyle w:val="Heading1"/>
         <w:keepNext/>
       </w:pPr>
       <w:r>
@@ -1165,7 +1165,7 @@
     </w:p>
     <w:p>
       <w:pPr>
-        <w:pStyle w:val="AgreementHeading"/>
+        <w:pStyle w:val="Heading1"/>
         <w:keepNext/>
       </w:pPr>
       <w:r>
@@ -1198,7 +1198,7 @@
     </w:p>
     <w:p>
       <w:pPr>
-        <w:pStyle w:val="AgreementHeading"/>
+        <w:pStyle w:val="Heading1"/>
         <w:keepNext/>
       </w:pPr>
       <w:r>
@@ -1290,7 +1290,7 @@
     </w:p>
     <w:p>
       <w:pPr>
-        <w:pStyle w:val="AgreementHeading"/>
+        <w:pStyle w:val="Heading1"/>
         <w:keepNext/>
       </w:pPr>
       <w:r>
@@ -1523,7 +1523,7 @@
     </w:p>
     <w:p>
       <w:pPr>
-        <w:pStyle w:val="AgreementHeading"/>
+        <w:pStyle w:val="Heading1"/>
         <w:keepNext/>
       </w:pPr>
       <w:r>
@@ -1808,7 +1808,7 @@
     </w:p>
     <w:p>
       <w:pPr>
-        <w:pStyle w:val="AgreementHeading"/>
+        <w:pStyle w:val="Heading1"/>
         <w:keepNext/>
       </w:pPr>
       <w:r>
@@ -1841,7 +1841,7 @@
     </w:p>
     <w:p>
       <w:pPr>
-        <w:pStyle w:val="AgreementHeading"/>
+        <w:pStyle w:val="Heading1"/>
         <w:keepNext/>
       </w:pPr>
       <w:r>
@@ -2061,7 +2061,7 @@
     </w:p>
     <w:p>
       <w:pPr>
-        <w:pStyle w:val="AgreementHeading"/>
+        <w:pStyle w:val="Heading1"/>
         <w:keepNext/>
       </w:pPr>
       <w:r>
@@ -2182,7 +2182,7 @@
     </w:p>
     <w:p>
       <w:pPr>
-        <w:pStyle w:val="AgreementHeading"/>
+        <w:pStyle w:val="Heading1"/>
         <w:keepNext/>
       </w:pPr>
       <w:r>
@@ -2266,7 +2266,7 @@
     </w:p>
     <w:p>
       <w:pPr>
-        <w:pStyle w:val="AgreementHeading"/>
+        <w:pStyle w:val="Heading1"/>
         <w:keepNext/>
       </w:pPr>
       <w:r>
@@ -2316,7 +2316,7 @@
     </w:p>
     <w:p>
       <w:pPr>
-        <w:pStyle w:val="AgreementHeading"/>
+        <w:pStyle w:val="Heading1"/>
         <w:keepNext/>
       </w:pPr>
       <w:r>
@@ -2582,9 +2582,16 @@
     <w:basedOn w:val="Normal"/>
     <w:next w:val="Normal"/>
     <w:qFormat/>
+    <w:pPr>
+      <w:keepNext/>
+      <w:keepLines/>
+      <w:spacing w:before="180" w:after="60"/>
+    </w:pPr>
     <w:rPr>
+      <w:rFonts w:ascii="Times New Roman" w:hAnsi="Times New Roman"/>
+      <w:b/>
       <w:color w:val="2E74B5"/>
-      <w:sz w:val="32"/>
+      <w:sz w:val="22"/>
       <w:szCs w:val="32"/>
     </w:rPr>
   </w:style>
@@ -2745,19 +2752,5 @@
       <w:sz w:val="22"/>
     </w:rPr>
   </w:style>
-  <w:style w:type="paragraph" w:customStyle="1" w:styleId="AgreementHeading">
-    <w:name w:val="Agreement Heading"/>
-    <w:basedOn w:val="Normal"/>
-    <w:pPr>
-      <w:keepNext/>
-      <w:keepLines/>
-      <w:spacing w:before="180" w:after="60"/>
-    </w:pPr>
-    <w:rPr>
-      <w:rFonts w:ascii="Times New Roman" w:hAnsi="Times New Roman"/>
-      <w:b/>
-      <w:sz w:val="22"/>
-    </w:rPr>
-  </w:style>
 </w:styles>
 </file>
</xml_diff>